<commit_message>
feat:creazione package e popolamento del model
</commit_message>
<xml_diff>
--- a/documentation/template-documentazione-progetto.docx
+++ b/documentation/template-documentazione-progetto.docx
@@ -1,6 +1,6 @@
 
 <file path=word/document.xml><?xml version="1.0" encoding="utf-8"?>
-<w:document xmlns:wpc="http://schemas.microsoft.com/office/word/2010/wordprocessingCanvas" xmlns:cx="http://schemas.microsoft.com/office/drawing/2014/chartex" xmlns:cx1="http://schemas.microsoft.com/office/drawing/2015/9/8/chartex" xmlns:cx2="http://schemas.microsoft.com/office/drawing/2015/10/21/chartex" xmlns:cx3="http://schemas.microsoft.com/office/drawing/2016/5/9/chartex" xmlns:cx4="http://schemas.microsoft.com/office/drawing/2016/5/10/chartex" xmlns:cx5="http://schemas.microsoft.com/office/drawing/2016/5/11/chartex" xmlns:cx6="http://schemas.microsoft.com/office/drawing/2016/5/12/chartex" xmlns:cx7="http://schemas.microsoft.com/office/drawing/2016/5/13/chartex" xmlns:cx8="http://schemas.microsoft.com/office/drawing/2016/5/14/chartex" xmlns:mc="http://schemas.openxmlformats.org/markup-compatibility/2006" xmlns:aink="http://schemas.microsoft.com/office/drawing/2016/ink" xmlns:am3d="http://schemas.microsoft.com/office/drawing/2017/model3d" xmlns:o="urn:schemas-microsoft-com:office:office" xmlns:oel="http://schemas.microsoft.com/office/2019/extlst" xmlns:r="http://schemas.openxmlformats.org/officeDocument/2006/relationships" xmlns:m="http://schemas.openxmlformats.org/officeDocument/2006/math" xmlns:v="urn:schemas-microsoft-com:vml" xmlns:wp14="http://schemas.microsoft.com/office/word/2010/wordprocessingDrawing" xmlns:wp="http://schemas.openxmlformats.org/drawingml/2006/wordprocessingDrawing" xmlns:w10="urn:schemas-microsoft-com:office:word" xmlns:w="http://schemas.openxmlformats.org/wordprocessingml/2006/main" xmlns:w14="http://schemas.microsoft.com/office/word/2010/wordml" xmlns:w15="http://schemas.microsoft.com/office/word/2012/wordml" xmlns:w16cex="http://schemas.microsoft.com/office/word/2018/wordml/cex" xmlns:w16cid="http://schemas.microsoft.com/office/word/2016/wordml/cid" xmlns:w16="http://schemas.microsoft.com/office/word/2018/wordml" xmlns:w16du="http://schemas.microsoft.com/office/word/2023/wordml/word16du" xmlns:w16sdtdh="http://schemas.microsoft.com/office/word/2020/wordml/sdtdatahash" xmlns:w16se="http://schemas.microsoft.com/office/word/2015/wordml/symex" xmlns:wpg="http://schemas.microsoft.com/office/word/2010/wordprocessingGroup" xmlns:wpi="http://schemas.microsoft.com/office/word/2010/wordprocessingInk" xmlns:wne="http://schemas.microsoft.com/office/word/2006/wordml" xmlns:wps="http://schemas.microsoft.com/office/word/2010/wordprocessingShape" mc:Ignorable="w14 w15 w16se w16cid w16 w16cex w16sdtdh wp14">
+<w:document xmlns:wpc="http://schemas.microsoft.com/office/word/2010/wordprocessingCanvas" xmlns:cx="http://schemas.microsoft.com/office/drawing/2014/chartex" xmlns:cx1="http://schemas.microsoft.com/office/drawing/2015/9/8/chartex" xmlns:cx2="http://schemas.microsoft.com/office/drawing/2015/10/21/chartex" xmlns:cx3="http://schemas.microsoft.com/office/drawing/2016/5/9/chartex" xmlns:cx4="http://schemas.microsoft.com/office/drawing/2016/5/10/chartex" xmlns:cx5="http://schemas.microsoft.com/office/drawing/2016/5/11/chartex" xmlns:cx6="http://schemas.microsoft.com/office/drawing/2016/5/12/chartex" xmlns:cx7="http://schemas.microsoft.com/office/drawing/2016/5/13/chartex" xmlns:cx8="http://schemas.microsoft.com/office/drawing/2016/5/14/chartex" xmlns:mc="http://schemas.openxmlformats.org/markup-compatibility/2006" xmlns:aink="http://schemas.microsoft.com/office/drawing/2016/ink" xmlns:am3d="http://schemas.microsoft.com/office/drawing/2017/model3d" xmlns:o="urn:schemas-microsoft-com:office:office" xmlns:r="http://schemas.openxmlformats.org/officeDocument/2006/relationships" xmlns:m="http://schemas.openxmlformats.org/officeDocument/2006/math" xmlns:v="urn:schemas-microsoft-com:vml" xmlns:wp14="http://schemas.microsoft.com/office/word/2010/wordprocessingDrawing" xmlns:wp="http://schemas.openxmlformats.org/drawingml/2006/wordprocessingDrawing" xmlns:w10="urn:schemas-microsoft-com:office:word" xmlns:w="http://schemas.openxmlformats.org/wordprocessingml/2006/main" xmlns:w14="http://schemas.microsoft.com/office/word/2010/wordml" xmlns:w15="http://schemas.microsoft.com/office/word/2012/wordml" xmlns:w16cid="http://schemas.microsoft.com/office/word/2016/wordml/cid" xmlns:w16se="http://schemas.microsoft.com/office/word/2015/wordml/symex" xmlns:wpg="http://schemas.microsoft.com/office/word/2010/wordprocessingGroup" xmlns:wpi="http://schemas.microsoft.com/office/word/2010/wordprocessingInk" xmlns:wne="http://schemas.microsoft.com/office/word/2006/wordml" xmlns:wps="http://schemas.microsoft.com/office/word/2010/wordprocessingShape" mc:Ignorable="w14 w15 w16se w16cid wp14">
   <w:body>
     <w:sdt>
       <w:sdtPr>
@@ -275,7 +275,7 @@
                   </wp:anchor>
                 </w:drawing>
               </mc:Choice>
-              <mc:Fallback>
+              <mc:Fallback xmlns:w16sdtdh="http://schemas.microsoft.com/office/word/2020/wordml/sdtdatahash" xmlns:w16du="http://schemas.microsoft.com/office/word/2023/wordml/word16du" xmlns:w16="http://schemas.microsoft.com/office/word/2018/wordml" xmlns:w16cex="http://schemas.microsoft.com/office/word/2018/wordml/cex" xmlns:oel="http://schemas.microsoft.com/office/2019/extlst">
                 <w:pict>
                   <v:line w14:anchorId="3D3A5B14" id="Connettore diritto 42" o:spid="_x0000_s1026" style="position:absolute;z-index:251655680;visibility:visible;mso-wrap-style:square;mso-width-percent:0;mso-wrap-distance-left:9pt;mso-wrap-distance-top:0;mso-wrap-distance-right:9pt;mso-wrap-distance-bottom:0;mso-position-horizontal:absolute;mso-position-horizontal-relative:text;mso-position-vertical:absolute;mso-position-vertical-relative:text;mso-width-percent:0;mso-width-relative:margin" from=".15pt,.6pt" to="425.55pt,.6pt" o:gfxdata="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" strokecolor="#4472c4 [3204]" strokeweight="1.75pt">
                     <v:stroke joinstyle="miter"/>
@@ -324,15 +324,10 @@
               <w:sz w:val="36"/>
               <w:szCs w:val="48"/>
             </w:rPr>
-            <w:t>Da sostituire con n</w:t>
+            <w:t>UnivaqChef</w:t>
           </w:r>
-          <w:r>
-            <w:rPr>
-              <w:sz w:val="36"/>
-              <w:szCs w:val="48"/>
-            </w:rPr>
-            <w:t>ome dell’applicazione</w:t>
-          </w:r>
+          <w:bookmarkStart w:id="0" w:name="_GoBack"/>
+          <w:bookmarkEnd w:id="0"/>
         </w:p>
         <w:p>
           <w:pPr>
@@ -358,11 +353,11 @@
             <w:tblLook w:val="01E0" w:firstRow="1" w:lastRow="1" w:firstColumn="1" w:lastColumn="1" w:noHBand="0" w:noVBand="0"/>
           </w:tblPr>
           <w:tblGrid>
-            <w:gridCol w:w="2962"/>
-            <w:gridCol w:w="1860"/>
-            <w:gridCol w:w="999"/>
-            <w:gridCol w:w="2966"/>
-            <w:gridCol w:w="70"/>
+            <w:gridCol w:w="2709"/>
+            <w:gridCol w:w="1711"/>
+            <w:gridCol w:w="892"/>
+            <w:gridCol w:w="3484"/>
+            <w:gridCol w:w="61"/>
           </w:tblGrid>
           <w:tr>
             <w:trPr>
@@ -392,18 +387,8 @@
                     <w:b/>
                     <w:szCs w:val="22"/>
                   </w:rPr>
-                  <w:t xml:space="preserve">Membri </w:t>
+                  <w:t>Membri del team</w:t>
                 </w:r>
-                <w:proofErr w:type="gramStart"/>
-                <w:r>
-                  <w:rPr>
-                    <w:rFonts w:cstheme="minorHAnsi"/>
-                    <w:b/>
-                    <w:szCs w:val="22"/>
-                  </w:rPr>
-                  <w:t>del team</w:t>
-                </w:r>
-                <w:proofErr w:type="gramEnd"/>
               </w:p>
             </w:tc>
           </w:tr>
@@ -535,10 +520,30 @@
                   <w:rPr>
                     <w:rFonts w:cstheme="minorHAnsi"/>
                     <w:b/>
-                    <w:color w:val="333399"/>
+                    <w:color w:val="000000" w:themeColor="text1"/>
                     <w:szCs w:val="22"/>
                   </w:rPr>
                 </w:pPr>
+                <w:proofErr w:type="spellStart"/>
+                <w:r>
+                  <w:rPr>
+                    <w:rFonts w:cstheme="minorHAnsi"/>
+                    <w:b/>
+                    <w:color w:val="000000" w:themeColor="text1"/>
+                    <w:szCs w:val="22"/>
+                  </w:rPr>
+                  <w:t>Fazi</w:t>
+                </w:r>
+                <w:proofErr w:type="spellEnd"/>
+                <w:r>
+                  <w:rPr>
+                    <w:rFonts w:cstheme="minorHAnsi"/>
+                    <w:b/>
+                    <w:color w:val="000000" w:themeColor="text1"/>
+                    <w:szCs w:val="22"/>
+                  </w:rPr>
+                  <w:t xml:space="preserve"> Michela</w:t>
+                </w:r>
               </w:p>
             </w:tc>
             <w:tc>
@@ -594,10 +599,31 @@
                   <w:adjustRightInd w:val="0"/>
                   <w:rPr>
                     <w:rFonts w:cstheme="minorHAnsi"/>
-                    <w:color w:val="333399"/>
+                    <w:b/>
+                    <w:color w:val="000000" w:themeColor="text1"/>
                     <w:szCs w:val="22"/>
                   </w:rPr>
                 </w:pPr>
+                <w:proofErr w:type="spellStart"/>
+                <w:r>
+                  <w:rPr>
+                    <w:rFonts w:cstheme="minorHAnsi"/>
+                    <w:b/>
+                    <w:color w:val="000000" w:themeColor="text1"/>
+                    <w:szCs w:val="22"/>
+                  </w:rPr>
+                  <w:t>Palladinelli</w:t>
+                </w:r>
+                <w:proofErr w:type="spellEnd"/>
+                <w:r>
+                  <w:rPr>
+                    <w:rFonts w:cstheme="minorHAnsi"/>
+                    <w:b/>
+                    <w:color w:val="000000" w:themeColor="text1"/>
+                    <w:szCs w:val="22"/>
+                  </w:rPr>
+                  <w:t xml:space="preserve"> Mattia</w:t>
+                </w:r>
               </w:p>
             </w:tc>
             <w:tc>
@@ -653,10 +679,20 @@
                   <w:adjustRightInd w:val="0"/>
                   <w:rPr>
                     <w:rFonts w:cstheme="minorHAnsi"/>
-                    <w:color w:val="333399"/>
+                    <w:b/>
+                    <w:color w:val="000000" w:themeColor="text1"/>
                     <w:szCs w:val="22"/>
                   </w:rPr>
                 </w:pPr>
+                <w:r>
+                  <w:rPr>
+                    <w:rFonts w:cstheme="minorHAnsi"/>
+                    <w:b/>
+                    <w:color w:val="000000" w:themeColor="text1"/>
+                    <w:szCs w:val="22"/>
+                  </w:rPr>
+                  <w:t>Scorrano Martina</w:t>
+                </w:r>
               </w:p>
             </w:tc>
             <w:tc>
@@ -671,10 +707,20 @@
                   <w:adjustRightInd w:val="0"/>
                   <w:rPr>
                     <w:rFonts w:cstheme="minorHAnsi"/>
-                    <w:color w:val="333399"/>
+                    <w:b/>
+                    <w:color w:val="000000" w:themeColor="text1"/>
                     <w:szCs w:val="22"/>
                   </w:rPr>
                 </w:pPr>
+                <w:r>
+                  <w:rPr>
+                    <w:rFonts w:cstheme="minorHAnsi"/>
+                    <w:b/>
+                    <w:color w:val="000000" w:themeColor="text1"/>
+                    <w:szCs w:val="22"/>
+                  </w:rPr>
+                  <w:t>298989</w:t>
+                </w:r>
               </w:p>
             </w:tc>
             <w:tc>
@@ -692,6 +738,22 @@
                     <w:szCs w:val="22"/>
                   </w:rPr>
                 </w:pPr>
+                <w:r>
+                  <w:rPr>
+                    <w:rFonts w:cstheme="minorHAnsi"/>
+                    <w:color w:val="000000" w:themeColor="text1"/>
+                    <w:szCs w:val="22"/>
+                  </w:rPr>
+                  <w:t>martina.scorrano@student.univaq.</w:t>
+                </w:r>
+                <w:r>
+                  <w:rPr>
+                    <w:rFonts w:cstheme="minorHAnsi"/>
+                    <w:color w:val="333399"/>
+                    <w:szCs w:val="22"/>
+                  </w:rPr>
+                  <w:t>it</w:t>
+                </w:r>
               </w:p>
             </w:tc>
           </w:tr>
@@ -886,7 +948,7 @@
                   </wp:anchor>
                 </w:drawing>
               </mc:Choice>
-              <mc:Fallback>
+              <mc:Fallback xmlns:w16sdtdh="http://schemas.microsoft.com/office/word/2020/wordml/sdtdatahash" xmlns:w16du="http://schemas.microsoft.com/office/word/2023/wordml/word16du" xmlns:w16="http://schemas.microsoft.com/office/word/2018/wordml" xmlns:w16cex="http://schemas.microsoft.com/office/word/2018/wordml/cex" xmlns:oel="http://schemas.microsoft.com/office/2019/extlst">
                 <w:pict>
                   <v:line w14:anchorId="4A4FB2F2" id="Connettore diritto 43" o:spid="_x0000_s1026" style="position:absolute;z-index:251695616;visibility:visible;mso-wrap-style:square;mso-width-percent:0;mso-wrap-distance-left:9pt;mso-wrap-distance-top:0;mso-wrap-distance-right:9pt;mso-wrap-distance-bottom:0;mso-position-horizontal:absolute;mso-position-horizontal-relative:text;mso-position-vertical:absolute;mso-position-vertical-relative:text;mso-width-percent:0;mso-width-relative:margin" from=".15pt,6.05pt" to="425.55pt,6.05pt" o:gfxdata="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" strokecolor="#4472c4 [3204]" strokeweight="1.5pt">
                     <v:stroke joinstyle="miter"/>
@@ -967,7 +1029,7 @@
               <w:sz w:val="28"/>
               <w:szCs w:val="28"/>
             </w:rPr>
-            <w:t>2</w:t>
+            <w:t>5</w:t>
           </w:r>
           <w:r>
             <w:rPr>
@@ -983,7 +1045,7 @@
               <w:sz w:val="28"/>
               <w:szCs w:val="28"/>
             </w:rPr>
-            <w:t>3</w:t>
+            <w:t>6</w:t>
           </w:r>
         </w:p>
         <w:p/>
@@ -1363,7 +1425,7 @@
           <w:szCs w:val="36"/>
         </w:rPr>
       </w:pPr>
-      <w:bookmarkStart w:id="0" w:name="_Toc1939455"/>
+      <w:bookmarkStart w:id="1" w:name="_Toc1939455"/>
       <w:r>
         <w:br w:type="page"/>
       </w:r>
@@ -1375,8 +1437,8 @@
           <w:rFonts w:cstheme="majorHAnsi"/>
         </w:rPr>
       </w:pPr>
-      <w:bookmarkStart w:id="1" w:name="_Toc38393257"/>
-      <w:bookmarkEnd w:id="0"/>
+      <w:bookmarkStart w:id="2" w:name="_Toc38393257"/>
+      <w:bookmarkEnd w:id="1"/>
       <w:r>
         <w:rPr>
           <w:rFonts w:cstheme="majorHAnsi"/>
@@ -1384,7 +1446,7 @@
         <w:lastRenderedPageBreak/>
         <w:t>Capitolo 1 – Caso di studio</w:t>
       </w:r>
-      <w:bookmarkEnd w:id="1"/>
+      <w:bookmarkEnd w:id="2"/>
     </w:p>
     <w:p>
       <w:pPr>
@@ -1400,7 +1462,7 @@
           <w:rFonts w:cstheme="majorHAnsi"/>
         </w:rPr>
       </w:pPr>
-      <w:bookmarkStart w:id="2" w:name="_Toc38393258"/>
+      <w:bookmarkStart w:id="3" w:name="_Toc38393258"/>
       <w:r>
         <w:rPr>
           <w:rFonts w:cstheme="majorHAnsi"/>
@@ -1413,7 +1475,7 @@
         </w:rPr>
         <w:t>– Descrizione dell’applicazione</w:t>
       </w:r>
-      <w:bookmarkEnd w:id="2"/>
+      <w:bookmarkEnd w:id="3"/>
     </w:p>
     <w:p>
       <w:pPr>
@@ -1531,7 +1593,7 @@
           <w:rFonts w:cstheme="majorHAnsi"/>
         </w:rPr>
       </w:pPr>
-      <w:bookmarkStart w:id="3" w:name="_Toc38393259"/>
+      <w:bookmarkStart w:id="4" w:name="_Toc38393259"/>
       <w:r>
         <w:rPr>
           <w:rFonts w:cstheme="majorHAnsi"/>
@@ -1563,7 +1625,7 @@
         </w:rPr>
         <w:t>Funzionalità</w:t>
       </w:r>
-      <w:bookmarkEnd w:id="3"/>
+      <w:bookmarkEnd w:id="4"/>
       <w:r>
         <w:rPr>
           <w:rFonts w:cstheme="majorHAnsi"/>
@@ -1653,7 +1715,7 @@
       <w:r>
         <w:br w:type="page"/>
       </w:r>
-      <w:bookmarkStart w:id="4" w:name="_Toc38393260"/>
+      <w:bookmarkStart w:id="5" w:name="_Toc38393260"/>
       <w:r>
         <w:lastRenderedPageBreak/>
         <w:t xml:space="preserve">1.3 </w:t>
@@ -1667,7 +1729,7 @@
       <w:r>
         <w:t>Domain Model</w:t>
       </w:r>
-      <w:bookmarkEnd w:id="4"/>
+      <w:bookmarkEnd w:id="5"/>
     </w:p>
     <w:p>
       <w:pPr>
@@ -1705,13 +1767,27 @@
         <w:rPr>
           <w:rFonts w:cstheme="minorHAnsi"/>
         </w:rPr>
-        <w:t>Mostrare un c</w:t>
+        <w:t xml:space="preserve">Mostrare un </w:t>
+      </w:r>
+      <w:proofErr w:type="spellStart"/>
+      <w:r>
+        <w:rPr>
+          <w:rFonts w:cstheme="minorHAnsi"/>
+        </w:rPr>
+        <w:t>c</w:t>
       </w:r>
       <w:r>
         <w:rPr>
           <w:rFonts w:cstheme="minorHAnsi"/>
         </w:rPr>
-        <w:t xml:space="preserve">lass </w:t>
+        <w:t>lass</w:t>
+      </w:r>
+      <w:proofErr w:type="spellEnd"/>
+      <w:r>
+        <w:rPr>
+          <w:rFonts w:cstheme="minorHAnsi"/>
+        </w:rPr>
+        <w:t xml:space="preserve"> </w:t>
       </w:r>
       <w:proofErr w:type="spellStart"/>
       <w:r>
@@ -1804,7 +1880,7 @@
 </file>
 
 <file path=word/endnotes.xml><?xml version="1.0" encoding="utf-8"?>
-<w:endnotes xmlns:wpc="http://schemas.microsoft.com/office/word/2010/wordprocessingCanvas" xmlns:cx="http://schemas.microsoft.com/office/drawing/2014/chartex" xmlns:cx1="http://schemas.microsoft.com/office/drawing/2015/9/8/chartex" xmlns:cx2="http://schemas.microsoft.com/office/drawing/2015/10/21/chartex" xmlns:cx3="http://schemas.microsoft.com/office/drawing/2016/5/9/chartex" xmlns:cx4="http://schemas.microsoft.com/office/drawing/2016/5/10/chartex" xmlns:cx5="http://schemas.microsoft.com/office/drawing/2016/5/11/chartex" xmlns:cx6="http://schemas.microsoft.com/office/drawing/2016/5/12/chartex" xmlns:cx7="http://schemas.microsoft.com/office/drawing/2016/5/13/chartex" xmlns:cx8="http://schemas.microsoft.com/office/drawing/2016/5/14/chartex" xmlns:mc="http://schemas.openxmlformats.org/markup-compatibility/2006" xmlns:aink="http://schemas.microsoft.com/office/drawing/2016/ink" xmlns:am3d="http://schemas.microsoft.com/office/drawing/2017/model3d" xmlns:o="urn:schemas-microsoft-com:office:office" xmlns:oel="http://schemas.microsoft.com/office/2019/extlst" xmlns:r="http://schemas.openxmlformats.org/officeDocument/2006/relationships" xmlns:m="http://schemas.openxmlformats.org/officeDocument/2006/math" xmlns:v="urn:schemas-microsoft-com:vml" xmlns:wp14="http://schemas.microsoft.com/office/word/2010/wordprocessingDrawing" xmlns:wp="http://schemas.openxmlformats.org/drawingml/2006/wordprocessingDrawing" xmlns:w10="urn:schemas-microsoft-com:office:word" xmlns:w="http://schemas.openxmlformats.org/wordprocessingml/2006/main" xmlns:w14="http://schemas.microsoft.com/office/word/2010/wordml" xmlns:w15="http://schemas.microsoft.com/office/word/2012/wordml" xmlns:w16cex="http://schemas.microsoft.com/office/word/2018/wordml/cex" xmlns:w16cid="http://schemas.microsoft.com/office/word/2016/wordml/cid" xmlns:w16="http://schemas.microsoft.com/office/word/2018/wordml" xmlns:w16du="http://schemas.microsoft.com/office/word/2023/wordml/word16du" xmlns:w16sdtdh="http://schemas.microsoft.com/office/word/2020/wordml/sdtdatahash" xmlns:w16se="http://schemas.microsoft.com/office/word/2015/wordml/symex" xmlns:wpg="http://schemas.microsoft.com/office/word/2010/wordprocessingGroup" xmlns:wpi="http://schemas.microsoft.com/office/word/2010/wordprocessingInk" xmlns:wne="http://schemas.microsoft.com/office/word/2006/wordml" xmlns:wps="http://schemas.microsoft.com/office/word/2010/wordprocessingShape" mc:Ignorable="w14 w15 w16se w16cid w16 w16cex w16sdtdh wp14">
+<w:endnotes xmlns:wpc="http://schemas.microsoft.com/office/word/2010/wordprocessingCanvas" xmlns:cx="http://schemas.microsoft.com/office/drawing/2014/chartex" xmlns:cx1="http://schemas.microsoft.com/office/drawing/2015/9/8/chartex" xmlns:cx2="http://schemas.microsoft.com/office/drawing/2015/10/21/chartex" xmlns:cx3="http://schemas.microsoft.com/office/drawing/2016/5/9/chartex" xmlns:cx4="http://schemas.microsoft.com/office/drawing/2016/5/10/chartex" xmlns:cx5="http://schemas.microsoft.com/office/drawing/2016/5/11/chartex" xmlns:cx6="http://schemas.microsoft.com/office/drawing/2016/5/12/chartex" xmlns:cx7="http://schemas.microsoft.com/office/drawing/2016/5/13/chartex" xmlns:cx8="http://schemas.microsoft.com/office/drawing/2016/5/14/chartex" xmlns:mc="http://schemas.openxmlformats.org/markup-compatibility/2006" xmlns:aink="http://schemas.microsoft.com/office/drawing/2016/ink" xmlns:am3d="http://schemas.microsoft.com/office/drawing/2017/model3d" xmlns:o="urn:schemas-microsoft-com:office:office" xmlns:r="http://schemas.openxmlformats.org/officeDocument/2006/relationships" xmlns:m="http://schemas.openxmlformats.org/officeDocument/2006/math" xmlns:v="urn:schemas-microsoft-com:vml" xmlns:wp14="http://schemas.microsoft.com/office/word/2010/wordprocessingDrawing" xmlns:wp="http://schemas.openxmlformats.org/drawingml/2006/wordprocessingDrawing" xmlns:w10="urn:schemas-microsoft-com:office:word" xmlns:w="http://schemas.openxmlformats.org/wordprocessingml/2006/main" xmlns:w14="http://schemas.microsoft.com/office/word/2010/wordml" xmlns:w15="http://schemas.microsoft.com/office/word/2012/wordml" xmlns:w16cid="http://schemas.microsoft.com/office/word/2016/wordml/cid" xmlns:w16se="http://schemas.microsoft.com/office/word/2015/wordml/symex" xmlns:wpg="http://schemas.microsoft.com/office/word/2010/wordprocessingGroup" xmlns:wpi="http://schemas.microsoft.com/office/word/2010/wordprocessingInk" xmlns:wne="http://schemas.microsoft.com/office/word/2006/wordml" xmlns:wps="http://schemas.microsoft.com/office/word/2010/wordprocessingShape" mc:Ignorable="w14 w15 w16se w16cid wp14">
   <w:endnote w:type="separator" w:id="-1">
     <w:p>
       <w:pPr>
@@ -1829,7 +1905,7 @@
 </file>
 
 <file path=word/footer1.xml><?xml version="1.0" encoding="utf-8"?>
-<w:ftr xmlns:wpc="http://schemas.microsoft.com/office/word/2010/wordprocessingCanvas" xmlns:cx="http://schemas.microsoft.com/office/drawing/2014/chartex" xmlns:cx1="http://schemas.microsoft.com/office/drawing/2015/9/8/chartex" xmlns:cx2="http://schemas.microsoft.com/office/drawing/2015/10/21/chartex" xmlns:cx3="http://schemas.microsoft.com/office/drawing/2016/5/9/chartex" xmlns:cx4="http://schemas.microsoft.com/office/drawing/2016/5/10/chartex" xmlns:cx5="http://schemas.microsoft.com/office/drawing/2016/5/11/chartex" xmlns:cx6="http://schemas.microsoft.com/office/drawing/2016/5/12/chartex" xmlns:cx7="http://schemas.microsoft.com/office/drawing/2016/5/13/chartex" xmlns:cx8="http://schemas.microsoft.com/office/drawing/2016/5/14/chartex" xmlns:mc="http://schemas.openxmlformats.org/markup-compatibility/2006" xmlns:aink="http://schemas.microsoft.com/office/drawing/2016/ink" xmlns:am3d="http://schemas.microsoft.com/office/drawing/2017/model3d" xmlns:o="urn:schemas-microsoft-com:office:office" xmlns:oel="http://schemas.microsoft.com/office/2019/extlst" xmlns:r="http://schemas.openxmlformats.org/officeDocument/2006/relationships" xmlns:m="http://schemas.openxmlformats.org/officeDocument/2006/math" xmlns:v="urn:schemas-microsoft-com:vml" xmlns:wp14="http://schemas.microsoft.com/office/word/2010/wordprocessingDrawing" xmlns:wp="http://schemas.openxmlformats.org/drawingml/2006/wordprocessingDrawing" xmlns:w10="urn:schemas-microsoft-com:office:word" xmlns:w="http://schemas.openxmlformats.org/wordprocessingml/2006/main" xmlns:w14="http://schemas.microsoft.com/office/word/2010/wordml" xmlns:w15="http://schemas.microsoft.com/office/word/2012/wordml" xmlns:w16cex="http://schemas.microsoft.com/office/word/2018/wordml/cex" xmlns:w16cid="http://schemas.microsoft.com/office/word/2016/wordml/cid" xmlns:w16="http://schemas.microsoft.com/office/word/2018/wordml" xmlns:w16du="http://schemas.microsoft.com/office/word/2023/wordml/word16du" xmlns:w16sdtdh="http://schemas.microsoft.com/office/word/2020/wordml/sdtdatahash" xmlns:w16se="http://schemas.microsoft.com/office/word/2015/wordml/symex" xmlns:wpg="http://schemas.microsoft.com/office/word/2010/wordprocessingGroup" xmlns:wpi="http://schemas.microsoft.com/office/word/2010/wordprocessingInk" xmlns:wne="http://schemas.microsoft.com/office/word/2006/wordml" xmlns:wps="http://schemas.microsoft.com/office/word/2010/wordprocessingShape" mc:Ignorable="w14 w15 w16se w16cid w16 w16cex w16sdtdh wp14">
+<w:ftr xmlns:wpc="http://schemas.microsoft.com/office/word/2010/wordprocessingCanvas" xmlns:cx="http://schemas.microsoft.com/office/drawing/2014/chartex" xmlns:cx1="http://schemas.microsoft.com/office/drawing/2015/9/8/chartex" xmlns:cx2="http://schemas.microsoft.com/office/drawing/2015/10/21/chartex" xmlns:cx3="http://schemas.microsoft.com/office/drawing/2016/5/9/chartex" xmlns:cx4="http://schemas.microsoft.com/office/drawing/2016/5/10/chartex" xmlns:cx5="http://schemas.microsoft.com/office/drawing/2016/5/11/chartex" xmlns:cx6="http://schemas.microsoft.com/office/drawing/2016/5/12/chartex" xmlns:cx7="http://schemas.microsoft.com/office/drawing/2016/5/13/chartex" xmlns:cx8="http://schemas.microsoft.com/office/drawing/2016/5/14/chartex" xmlns:mc="http://schemas.openxmlformats.org/markup-compatibility/2006" xmlns:aink="http://schemas.microsoft.com/office/drawing/2016/ink" xmlns:am3d="http://schemas.microsoft.com/office/drawing/2017/model3d" xmlns:o="urn:schemas-microsoft-com:office:office" xmlns:r="http://schemas.openxmlformats.org/officeDocument/2006/relationships" xmlns:m="http://schemas.openxmlformats.org/officeDocument/2006/math" xmlns:v="urn:schemas-microsoft-com:vml" xmlns:wp14="http://schemas.microsoft.com/office/word/2010/wordprocessingDrawing" xmlns:wp="http://schemas.openxmlformats.org/drawingml/2006/wordprocessingDrawing" xmlns:w10="urn:schemas-microsoft-com:office:word" xmlns:w="http://schemas.openxmlformats.org/wordprocessingml/2006/main" xmlns:w14="http://schemas.microsoft.com/office/word/2010/wordml" xmlns:w15="http://schemas.microsoft.com/office/word/2012/wordml" xmlns:w16cid="http://schemas.microsoft.com/office/word/2016/wordml/cid" xmlns:w16se="http://schemas.microsoft.com/office/word/2015/wordml/symex" xmlns:wpg="http://schemas.microsoft.com/office/word/2010/wordprocessingGroup" xmlns:wpi="http://schemas.microsoft.com/office/word/2010/wordprocessingInk" xmlns:wne="http://schemas.microsoft.com/office/word/2006/wordml" xmlns:wps="http://schemas.microsoft.com/office/word/2010/wordprocessingShape" mc:Ignorable="w14 w15 w16se w16cid wp14">
   <w:sdt>
     <w:sdtPr>
       <w:id w:val="-2101093252"/>
@@ -1838,6 +1914,7 @@
         <w:docPartUnique/>
       </w:docPartObj>
     </w:sdtPr>
+    <w:sdtEndPr/>
     <w:sdtContent>
       <w:p>
         <w:pPr>
@@ -1874,7 +1951,7 @@
 </file>
 
 <file path=word/footnotes.xml><?xml version="1.0" encoding="utf-8"?>
-<w:footnotes xmlns:wpc="http://schemas.microsoft.com/office/word/2010/wordprocessingCanvas" xmlns:cx="http://schemas.microsoft.com/office/drawing/2014/chartex" xmlns:cx1="http://schemas.microsoft.com/office/drawing/2015/9/8/chartex" xmlns:cx2="http://schemas.microsoft.com/office/drawing/2015/10/21/chartex" xmlns:cx3="http://schemas.microsoft.com/office/drawing/2016/5/9/chartex" xmlns:cx4="http://schemas.microsoft.com/office/drawing/2016/5/10/chartex" xmlns:cx5="http://schemas.microsoft.com/office/drawing/2016/5/11/chartex" xmlns:cx6="http://schemas.microsoft.com/office/drawing/2016/5/12/chartex" xmlns:cx7="http://schemas.microsoft.com/office/drawing/2016/5/13/chartex" xmlns:cx8="http://schemas.microsoft.com/office/drawing/2016/5/14/chartex" xmlns:mc="http://schemas.openxmlformats.org/markup-compatibility/2006" xmlns:aink="http://schemas.microsoft.com/office/drawing/2016/ink" xmlns:am3d="http://schemas.microsoft.com/office/drawing/2017/model3d" xmlns:o="urn:schemas-microsoft-com:office:office" xmlns:oel="http://schemas.microsoft.com/office/2019/extlst" xmlns:r="http://schemas.openxmlformats.org/officeDocument/2006/relationships" xmlns:m="http://schemas.openxmlformats.org/officeDocument/2006/math" xmlns:v="urn:schemas-microsoft-com:vml" xmlns:wp14="http://schemas.microsoft.com/office/word/2010/wordprocessingDrawing" xmlns:wp="http://schemas.openxmlformats.org/drawingml/2006/wordprocessingDrawing" xmlns:w10="urn:schemas-microsoft-com:office:word" xmlns:w="http://schemas.openxmlformats.org/wordprocessingml/2006/main" xmlns:w14="http://schemas.microsoft.com/office/word/2010/wordml" xmlns:w15="http://schemas.microsoft.com/office/word/2012/wordml" xmlns:w16cex="http://schemas.microsoft.com/office/word/2018/wordml/cex" xmlns:w16cid="http://schemas.microsoft.com/office/word/2016/wordml/cid" xmlns:w16="http://schemas.microsoft.com/office/word/2018/wordml" xmlns:w16du="http://schemas.microsoft.com/office/word/2023/wordml/word16du" xmlns:w16sdtdh="http://schemas.microsoft.com/office/word/2020/wordml/sdtdatahash" xmlns:w16se="http://schemas.microsoft.com/office/word/2015/wordml/symex" xmlns:wpg="http://schemas.microsoft.com/office/word/2010/wordprocessingGroup" xmlns:wpi="http://schemas.microsoft.com/office/word/2010/wordprocessingInk" xmlns:wne="http://schemas.microsoft.com/office/word/2006/wordml" xmlns:wps="http://schemas.microsoft.com/office/word/2010/wordprocessingShape" mc:Ignorable="w14 w15 w16se w16cid w16 w16cex w16sdtdh wp14">
+<w:footnotes xmlns:wpc="http://schemas.microsoft.com/office/word/2010/wordprocessingCanvas" xmlns:cx="http://schemas.microsoft.com/office/drawing/2014/chartex" xmlns:cx1="http://schemas.microsoft.com/office/drawing/2015/9/8/chartex" xmlns:cx2="http://schemas.microsoft.com/office/drawing/2015/10/21/chartex" xmlns:cx3="http://schemas.microsoft.com/office/drawing/2016/5/9/chartex" xmlns:cx4="http://schemas.microsoft.com/office/drawing/2016/5/10/chartex" xmlns:cx5="http://schemas.microsoft.com/office/drawing/2016/5/11/chartex" xmlns:cx6="http://schemas.microsoft.com/office/drawing/2016/5/12/chartex" xmlns:cx7="http://schemas.microsoft.com/office/drawing/2016/5/13/chartex" xmlns:cx8="http://schemas.microsoft.com/office/drawing/2016/5/14/chartex" xmlns:mc="http://schemas.openxmlformats.org/markup-compatibility/2006" xmlns:aink="http://schemas.microsoft.com/office/drawing/2016/ink" xmlns:am3d="http://schemas.microsoft.com/office/drawing/2017/model3d" xmlns:o="urn:schemas-microsoft-com:office:office" xmlns:r="http://schemas.openxmlformats.org/officeDocument/2006/relationships" xmlns:m="http://schemas.openxmlformats.org/officeDocument/2006/math" xmlns:v="urn:schemas-microsoft-com:vml" xmlns:wp14="http://schemas.microsoft.com/office/word/2010/wordprocessingDrawing" xmlns:wp="http://schemas.openxmlformats.org/drawingml/2006/wordprocessingDrawing" xmlns:w10="urn:schemas-microsoft-com:office:word" xmlns:w="http://schemas.openxmlformats.org/wordprocessingml/2006/main" xmlns:w14="http://schemas.microsoft.com/office/word/2010/wordml" xmlns:w15="http://schemas.microsoft.com/office/word/2012/wordml" xmlns:w16cid="http://schemas.microsoft.com/office/word/2016/wordml/cid" xmlns:w16se="http://schemas.microsoft.com/office/word/2015/wordml/symex" xmlns:wpg="http://schemas.microsoft.com/office/word/2010/wordprocessingGroup" xmlns:wpi="http://schemas.microsoft.com/office/word/2010/wordprocessingInk" xmlns:wne="http://schemas.microsoft.com/office/word/2006/wordml" xmlns:wps="http://schemas.microsoft.com/office/word/2010/wordprocessingShape" mc:Ignorable="w14 w15 w16se w16cid wp14">
   <w:footnote w:type="separator" w:id="-1">
     <w:p>
       <w:pPr>
@@ -1899,7 +1976,7 @@
 </file>
 
 <file path=word/header1.xml><?xml version="1.0" encoding="utf-8"?>
-<w:hdr xmlns:wpc="http://schemas.microsoft.com/office/word/2010/wordprocessingCanvas" xmlns:cx="http://schemas.microsoft.com/office/drawing/2014/chartex" xmlns:cx1="http://schemas.microsoft.com/office/drawing/2015/9/8/chartex" xmlns:cx2="http://schemas.microsoft.com/office/drawing/2015/10/21/chartex" xmlns:cx3="http://schemas.microsoft.com/office/drawing/2016/5/9/chartex" xmlns:cx4="http://schemas.microsoft.com/office/drawing/2016/5/10/chartex" xmlns:cx5="http://schemas.microsoft.com/office/drawing/2016/5/11/chartex" xmlns:cx6="http://schemas.microsoft.com/office/drawing/2016/5/12/chartex" xmlns:cx7="http://schemas.microsoft.com/office/drawing/2016/5/13/chartex" xmlns:cx8="http://schemas.microsoft.com/office/drawing/2016/5/14/chartex" xmlns:mc="http://schemas.openxmlformats.org/markup-compatibility/2006" xmlns:aink="http://schemas.microsoft.com/office/drawing/2016/ink" xmlns:am3d="http://schemas.microsoft.com/office/drawing/2017/model3d" xmlns:o="urn:schemas-microsoft-com:office:office" xmlns:oel="http://schemas.microsoft.com/office/2019/extlst" xmlns:r="http://schemas.openxmlformats.org/officeDocument/2006/relationships" xmlns:m="http://schemas.openxmlformats.org/officeDocument/2006/math" xmlns:v="urn:schemas-microsoft-com:vml" xmlns:wp14="http://schemas.microsoft.com/office/word/2010/wordprocessingDrawing" xmlns:wp="http://schemas.openxmlformats.org/drawingml/2006/wordprocessingDrawing" xmlns:w10="urn:schemas-microsoft-com:office:word" xmlns:w="http://schemas.openxmlformats.org/wordprocessingml/2006/main" xmlns:w14="http://schemas.microsoft.com/office/word/2010/wordml" xmlns:w15="http://schemas.microsoft.com/office/word/2012/wordml" xmlns:w16cex="http://schemas.microsoft.com/office/word/2018/wordml/cex" xmlns:w16cid="http://schemas.microsoft.com/office/word/2016/wordml/cid" xmlns:w16="http://schemas.microsoft.com/office/word/2018/wordml" xmlns:w16du="http://schemas.microsoft.com/office/word/2023/wordml/word16du" xmlns:w16sdtdh="http://schemas.microsoft.com/office/word/2020/wordml/sdtdatahash" xmlns:w16se="http://schemas.microsoft.com/office/word/2015/wordml/symex" xmlns:wpg="http://schemas.microsoft.com/office/word/2010/wordprocessingGroup" xmlns:wpi="http://schemas.microsoft.com/office/word/2010/wordprocessingInk" xmlns:wne="http://schemas.microsoft.com/office/word/2006/wordml" xmlns:wps="http://schemas.microsoft.com/office/word/2010/wordprocessingShape" mc:Ignorable="w14 w15 w16se w16cid w16 w16cex w16sdtdh wp14">
+<w:hdr xmlns:wpc="http://schemas.microsoft.com/office/word/2010/wordprocessingCanvas" xmlns:cx="http://schemas.microsoft.com/office/drawing/2014/chartex" xmlns:cx1="http://schemas.microsoft.com/office/drawing/2015/9/8/chartex" xmlns:cx2="http://schemas.microsoft.com/office/drawing/2015/10/21/chartex" xmlns:cx3="http://schemas.microsoft.com/office/drawing/2016/5/9/chartex" xmlns:cx4="http://schemas.microsoft.com/office/drawing/2016/5/10/chartex" xmlns:cx5="http://schemas.microsoft.com/office/drawing/2016/5/11/chartex" xmlns:cx6="http://schemas.microsoft.com/office/drawing/2016/5/12/chartex" xmlns:cx7="http://schemas.microsoft.com/office/drawing/2016/5/13/chartex" xmlns:cx8="http://schemas.microsoft.com/office/drawing/2016/5/14/chartex" xmlns:mc="http://schemas.openxmlformats.org/markup-compatibility/2006" xmlns:aink="http://schemas.microsoft.com/office/drawing/2016/ink" xmlns:am3d="http://schemas.microsoft.com/office/drawing/2017/model3d" xmlns:o="urn:schemas-microsoft-com:office:office" xmlns:r="http://schemas.openxmlformats.org/officeDocument/2006/relationships" xmlns:m="http://schemas.openxmlformats.org/officeDocument/2006/math" xmlns:v="urn:schemas-microsoft-com:vml" xmlns:wp14="http://schemas.microsoft.com/office/word/2010/wordprocessingDrawing" xmlns:wp="http://schemas.openxmlformats.org/drawingml/2006/wordprocessingDrawing" xmlns:w10="urn:schemas-microsoft-com:office:word" xmlns:w="http://schemas.openxmlformats.org/wordprocessingml/2006/main" xmlns:w14="http://schemas.microsoft.com/office/word/2010/wordml" xmlns:w15="http://schemas.microsoft.com/office/word/2012/wordml" xmlns:w16cid="http://schemas.microsoft.com/office/word/2016/wordml/cid" xmlns:w16se="http://schemas.microsoft.com/office/word/2015/wordml/symex" xmlns:wpg="http://schemas.microsoft.com/office/word/2010/wordprocessingGroup" xmlns:wpi="http://schemas.microsoft.com/office/word/2010/wordprocessingInk" xmlns:wne="http://schemas.microsoft.com/office/word/2006/wordml" xmlns:wps="http://schemas.microsoft.com/office/word/2010/wordprocessingShape" mc:Ignorable="w14 w15 w16se w16cid wp14">
   <w:p>
     <w:pPr>
       <w:pStyle w:val="Intestazione"/>
@@ -1919,7 +1996,7 @@
 </file>
 
 <file path=word/numbering.xml><?xml version="1.0" encoding="utf-8"?>
-<w:numbering xmlns:wpc="http://schemas.microsoft.com/office/word/2010/wordprocessingCanvas" xmlns:cx="http://schemas.microsoft.com/office/drawing/2014/chartex" xmlns:cx1="http://schemas.microsoft.com/office/drawing/2015/9/8/chartex" xmlns:cx2="http://schemas.microsoft.com/office/drawing/2015/10/21/chartex" xmlns:cx3="http://schemas.microsoft.com/office/drawing/2016/5/9/chartex" xmlns:cx4="http://schemas.microsoft.com/office/drawing/2016/5/10/chartex" xmlns:cx5="http://schemas.microsoft.com/office/drawing/2016/5/11/chartex" xmlns:cx6="http://schemas.microsoft.com/office/drawing/2016/5/12/chartex" xmlns:cx7="http://schemas.microsoft.com/office/drawing/2016/5/13/chartex" xmlns:cx8="http://schemas.microsoft.com/office/drawing/2016/5/14/chartex" xmlns:mc="http://schemas.openxmlformats.org/markup-compatibility/2006" xmlns:aink="http://schemas.microsoft.com/office/drawing/2016/ink" xmlns:am3d="http://schemas.microsoft.com/office/drawing/2017/model3d" xmlns:o="urn:schemas-microsoft-com:office:office" xmlns:oel="http://schemas.microsoft.com/office/2019/extlst" xmlns:r="http://schemas.openxmlformats.org/officeDocument/2006/relationships" xmlns:m="http://schemas.openxmlformats.org/officeDocument/2006/math" xmlns:v="urn:schemas-microsoft-com:vml" xmlns:wp14="http://schemas.microsoft.com/office/word/2010/wordprocessingDrawing" xmlns:wp="http://schemas.openxmlformats.org/drawingml/2006/wordprocessingDrawing" xmlns:w10="urn:schemas-microsoft-com:office:word" xmlns:w="http://schemas.openxmlformats.org/wordprocessingml/2006/main" xmlns:w14="http://schemas.microsoft.com/office/word/2010/wordml" xmlns:w15="http://schemas.microsoft.com/office/word/2012/wordml" xmlns:w16cex="http://schemas.microsoft.com/office/word/2018/wordml/cex" xmlns:w16cid="http://schemas.microsoft.com/office/word/2016/wordml/cid" xmlns:w16="http://schemas.microsoft.com/office/word/2018/wordml" xmlns:w16du="http://schemas.microsoft.com/office/word/2023/wordml/word16du" xmlns:w16sdtdh="http://schemas.microsoft.com/office/word/2020/wordml/sdtdatahash" xmlns:w16se="http://schemas.microsoft.com/office/word/2015/wordml/symex" xmlns:wpg="http://schemas.microsoft.com/office/word/2010/wordprocessingGroup" xmlns:wpi="http://schemas.microsoft.com/office/word/2010/wordprocessingInk" xmlns:wne="http://schemas.microsoft.com/office/word/2006/wordml" xmlns:wps="http://schemas.microsoft.com/office/word/2010/wordprocessingShape" mc:Ignorable="w14 w15 w16se w16cid w16 w16cex w16sdtdh wp14">
+<w:numbering xmlns:wpc="http://schemas.microsoft.com/office/word/2010/wordprocessingCanvas" xmlns:cx="http://schemas.microsoft.com/office/drawing/2014/chartex" xmlns:cx1="http://schemas.microsoft.com/office/drawing/2015/9/8/chartex" xmlns:cx2="http://schemas.microsoft.com/office/drawing/2015/10/21/chartex" xmlns:cx3="http://schemas.microsoft.com/office/drawing/2016/5/9/chartex" xmlns:cx4="http://schemas.microsoft.com/office/drawing/2016/5/10/chartex" xmlns:cx5="http://schemas.microsoft.com/office/drawing/2016/5/11/chartex" xmlns:cx6="http://schemas.microsoft.com/office/drawing/2016/5/12/chartex" xmlns:cx7="http://schemas.microsoft.com/office/drawing/2016/5/13/chartex" xmlns:cx8="http://schemas.microsoft.com/office/drawing/2016/5/14/chartex" xmlns:mc="http://schemas.openxmlformats.org/markup-compatibility/2006" xmlns:aink="http://schemas.microsoft.com/office/drawing/2016/ink" xmlns:am3d="http://schemas.microsoft.com/office/drawing/2017/model3d" xmlns:o="urn:schemas-microsoft-com:office:office" xmlns:r="http://schemas.openxmlformats.org/officeDocument/2006/relationships" xmlns:m="http://schemas.openxmlformats.org/officeDocument/2006/math" xmlns:v="urn:schemas-microsoft-com:vml" xmlns:wp14="http://schemas.microsoft.com/office/word/2010/wordprocessingDrawing" xmlns:wp="http://schemas.openxmlformats.org/drawingml/2006/wordprocessingDrawing" xmlns:w10="urn:schemas-microsoft-com:office:word" xmlns:w="http://schemas.openxmlformats.org/wordprocessingml/2006/main" xmlns:w14="http://schemas.microsoft.com/office/word/2010/wordml" xmlns:w15="http://schemas.microsoft.com/office/word/2012/wordml" xmlns:w16cid="http://schemas.microsoft.com/office/word/2016/wordml/cid" xmlns:w16se="http://schemas.microsoft.com/office/word/2015/wordml/symex" xmlns:wpg="http://schemas.microsoft.com/office/word/2010/wordprocessingGroup" xmlns:wpi="http://schemas.microsoft.com/office/word/2010/wordprocessingInk" xmlns:wne="http://schemas.microsoft.com/office/word/2006/wordml" xmlns:wps="http://schemas.microsoft.com/office/word/2010/wordprocessingShape" mc:Ignorable="w14 w15 w16se w16cid wp14">
   <w:abstractNum w:abstractNumId="0" w15:restartNumberingAfterBreak="0">
     <w:nsid w:val="04281BDD"/>
     <w:multiLevelType w:val="hybridMultilevel"/>
@@ -4061,125 +4138,125 @@
       </w:rPr>
     </w:lvl>
   </w:abstractNum>
-  <w:num w:numId="1" w16cid:durableId="707684663">
+  <w:num w:numId="1">
     <w:abstractNumId w:val="3"/>
   </w:num>
-  <w:num w:numId="2" w16cid:durableId="1142624036">
+  <w:num w:numId="2">
     <w:abstractNumId w:val="13"/>
   </w:num>
-  <w:num w:numId="3" w16cid:durableId="135298065">
+  <w:num w:numId="3">
     <w:abstractNumId w:val="1"/>
   </w:num>
-  <w:num w:numId="4" w16cid:durableId="1044913163">
+  <w:num w:numId="4">
     <w:abstractNumId w:val="11"/>
   </w:num>
-  <w:num w:numId="5" w16cid:durableId="1645161166">
+  <w:num w:numId="5">
     <w:abstractNumId w:val="4"/>
   </w:num>
-  <w:num w:numId="6" w16cid:durableId="1452243454">
+  <w:num w:numId="6">
     <w:abstractNumId w:val="7"/>
   </w:num>
-  <w:num w:numId="7" w16cid:durableId="1521814851">
+  <w:num w:numId="7">
     <w:abstractNumId w:val="18"/>
   </w:num>
-  <w:num w:numId="8" w16cid:durableId="372312651">
+  <w:num w:numId="8">
     <w:abstractNumId w:val="6"/>
   </w:num>
-  <w:num w:numId="9" w16cid:durableId="668412728">
+  <w:num w:numId="9">
     <w:abstractNumId w:val="17"/>
   </w:num>
-  <w:num w:numId="10" w16cid:durableId="678001973">
+  <w:num w:numId="10">
     <w:abstractNumId w:val="10"/>
   </w:num>
-  <w:num w:numId="11" w16cid:durableId="1473524877">
+  <w:num w:numId="11">
     <w:abstractNumId w:val="8"/>
   </w:num>
-  <w:num w:numId="12" w16cid:durableId="434635551">
+  <w:num w:numId="12">
     <w:abstractNumId w:val="16"/>
   </w:num>
-  <w:num w:numId="13" w16cid:durableId="349651664">
+  <w:num w:numId="13">
     <w:abstractNumId w:val="5"/>
   </w:num>
-  <w:num w:numId="14" w16cid:durableId="762341061">
+  <w:num w:numId="14">
     <w:abstractNumId w:val="9"/>
   </w:num>
-  <w:num w:numId="15" w16cid:durableId="967589849">
+  <w:num w:numId="15">
     <w:abstractNumId w:val="0"/>
   </w:num>
-  <w:num w:numId="16" w16cid:durableId="1017661866">
+  <w:num w:numId="16">
     <w:abstractNumId w:val="15"/>
   </w:num>
-  <w:num w:numId="17" w16cid:durableId="297996149">
+  <w:num w:numId="17">
     <w:abstractNumId w:val="2"/>
   </w:num>
-  <w:num w:numId="18" w16cid:durableId="852765286">
+  <w:num w:numId="18">
     <w:abstractNumId w:val="2"/>
   </w:num>
-  <w:num w:numId="19" w16cid:durableId="1801730539">
+  <w:num w:numId="19">
     <w:abstractNumId w:val="2"/>
   </w:num>
-  <w:num w:numId="20" w16cid:durableId="586698662">
+  <w:num w:numId="20">
     <w:abstractNumId w:val="2"/>
   </w:num>
-  <w:num w:numId="21" w16cid:durableId="611909873">
+  <w:num w:numId="21">
     <w:abstractNumId w:val="2"/>
   </w:num>
-  <w:num w:numId="22" w16cid:durableId="988753756">
+  <w:num w:numId="22">
     <w:abstractNumId w:val="2"/>
   </w:num>
-  <w:num w:numId="23" w16cid:durableId="540750922">
+  <w:num w:numId="23">
     <w:abstractNumId w:val="2"/>
   </w:num>
-  <w:num w:numId="24" w16cid:durableId="209154720">
+  <w:num w:numId="24">
     <w:abstractNumId w:val="2"/>
   </w:num>
-  <w:num w:numId="25" w16cid:durableId="763309451">
+  <w:num w:numId="25">
     <w:abstractNumId w:val="2"/>
   </w:num>
-  <w:num w:numId="26" w16cid:durableId="848566820">
+  <w:num w:numId="26">
     <w:abstractNumId w:val="2"/>
   </w:num>
-  <w:num w:numId="27" w16cid:durableId="1733773783">
+  <w:num w:numId="27">
     <w:abstractNumId w:val="2"/>
   </w:num>
-  <w:num w:numId="28" w16cid:durableId="312027060">
+  <w:num w:numId="28">
     <w:abstractNumId w:val="2"/>
   </w:num>
-  <w:num w:numId="29" w16cid:durableId="1805537011">
+  <w:num w:numId="29">
     <w:abstractNumId w:val="2"/>
   </w:num>
-  <w:num w:numId="30" w16cid:durableId="7752435">
+  <w:num w:numId="30">
     <w:abstractNumId w:val="2"/>
   </w:num>
-  <w:num w:numId="31" w16cid:durableId="1682589343">
+  <w:num w:numId="31">
     <w:abstractNumId w:val="2"/>
   </w:num>
-  <w:num w:numId="32" w16cid:durableId="279264645">
+  <w:num w:numId="32">
     <w:abstractNumId w:val="2"/>
   </w:num>
-  <w:num w:numId="33" w16cid:durableId="787434111">
+  <w:num w:numId="33">
     <w:abstractNumId w:val="2"/>
   </w:num>
-  <w:num w:numId="34" w16cid:durableId="68579841">
+  <w:num w:numId="34">
     <w:abstractNumId w:val="2"/>
   </w:num>
-  <w:num w:numId="35" w16cid:durableId="2082484029">
+  <w:num w:numId="35">
     <w:abstractNumId w:val="2"/>
   </w:num>
-  <w:num w:numId="36" w16cid:durableId="1024945546">
+  <w:num w:numId="36">
     <w:abstractNumId w:val="2"/>
   </w:num>
-  <w:num w:numId="37" w16cid:durableId="1350370316">
+  <w:num w:numId="37">
     <w:abstractNumId w:val="14"/>
   </w:num>
-  <w:num w:numId="38" w16cid:durableId="540095777">
+  <w:num w:numId="38">
     <w:abstractNumId w:val="12"/>
   </w:num>
 </w:numbering>
 </file>
 
 <file path=word/styles.xml><?xml version="1.0" encoding="utf-8"?>
-<w:styles xmlns:mc="http://schemas.openxmlformats.org/markup-compatibility/2006" xmlns:r="http://schemas.openxmlformats.org/officeDocument/2006/relationships" xmlns:w="http://schemas.openxmlformats.org/wordprocessingml/2006/main" xmlns:w14="http://schemas.microsoft.com/office/word/2010/wordml" xmlns:w15="http://schemas.microsoft.com/office/word/2012/wordml" xmlns:w16cex="http://schemas.microsoft.com/office/word/2018/wordml/cex" xmlns:w16cid="http://schemas.microsoft.com/office/word/2016/wordml/cid" xmlns:w16="http://schemas.microsoft.com/office/word/2018/wordml" xmlns:w16sdtdh="http://schemas.microsoft.com/office/word/2020/wordml/sdtdatahash" xmlns:w16se="http://schemas.microsoft.com/office/word/2015/wordml/symex" mc:Ignorable="w14 w15 w16se w16cid w16 w16cex w16sdtdh">
+<w:styles xmlns:mc="http://schemas.openxmlformats.org/markup-compatibility/2006" xmlns:r="http://schemas.openxmlformats.org/officeDocument/2006/relationships" xmlns:w="http://schemas.openxmlformats.org/wordprocessingml/2006/main" xmlns:w14="http://schemas.microsoft.com/office/word/2010/wordml" xmlns:w15="http://schemas.microsoft.com/office/word/2012/wordml" xmlns:w16cid="http://schemas.microsoft.com/office/word/2016/wordml/cid" xmlns:w16se="http://schemas.microsoft.com/office/word/2015/wordml/symex" mc:Ignorable="w14 w15 w16se w16cid">
   <w:docDefaults>
     <w:rPrDefault>
       <w:rPr>
@@ -4195,7 +4272,7 @@
       </w:pPr>
     </w:pPrDefault>
   </w:docDefaults>
-  <w:latentStyles w:defLockedState="0" w:defUIPriority="99" w:defSemiHidden="0" w:defUnhideWhenUsed="0" w:defQFormat="0" w:count="376">
+  <w:latentStyles w:defLockedState="0" w:defUIPriority="99" w:defSemiHidden="0" w:defUnhideWhenUsed="0" w:defQFormat="0" w:count="375">
     <w:lsdException w:name="Normal" w:uiPriority="0" w:qFormat="1"/>
     <w:lsdException w:name="heading 1" w:uiPriority="9" w:qFormat="1"/>
     <w:lsdException w:name="heading 2" w:semiHidden="1" w:uiPriority="9" w:unhideWhenUsed="1" w:qFormat="1"/>
@@ -4571,7 +4648,6 @@
     <w:lsdException w:name="Smart Hyperlink" w:semiHidden="1" w:unhideWhenUsed="1"/>
     <w:lsdException w:name="Hashtag" w:semiHidden="1" w:unhideWhenUsed="1"/>
     <w:lsdException w:name="Unresolved Mention" w:semiHidden="1" w:unhideWhenUsed="1"/>
-    <w:lsdException w:name="Smart Link" w:semiHidden="1" w:unhideWhenUsed="1"/>
   </w:latentStyles>
   <w:style w:type="paragraph" w:default="1" w:styleId="Normale">
     <w:name w:val="Normal"/>
@@ -6008,16 +6084,6 @@
 </file>
 
 <file path=customXml/item2.xml><?xml version="1.0" encoding="utf-8"?>
-<p:properties xmlns:p="http://schemas.microsoft.com/office/2006/metadata/properties" xmlns:xsi="http://www.w3.org/2001/XMLSchema-instance" xmlns:pc="http://schemas.microsoft.com/office/infopath/2007/PartnerControls">
-  <documentManagement/>
-</p:properties>
-</file>
-
-<file path=customXml/item3.xml><?xml version="1.0" encoding="utf-8"?>
-<b:Sources xmlns:b="http://schemas.openxmlformats.org/officeDocument/2006/bibliography" xmlns="http://schemas.openxmlformats.org/officeDocument/2006/bibliography" SelectedStyle="\APASixthEditionOfficeOnline.xsl" StyleName="APA" Version="6"/>
-</file>
-
-<file path=customXml/item4.xml><?xml version="1.0" encoding="utf-8"?>
 <ct:contentTypeSchema xmlns:ct="http://schemas.microsoft.com/office/2006/metadata/contentType" xmlns:ma="http://schemas.microsoft.com/office/2006/metadata/properties/metaAttributes" ct:_="" ma:_="" ma:contentTypeName="Documento" ma:contentTypeID="0x010100EC5AE4BB47ADB040B13A5770277872A9" ma:contentTypeVersion="2" ma:contentTypeDescription="Creare un nuovo documento." ma:contentTypeScope="" ma:versionID="ca7759a5f003f18dfc4f4bd63dcfc6bf">
   <xsd:schema xmlns:xsd="http://www.w3.org/2001/XMLSchema" xmlns:xs="http://www.w3.org/2001/XMLSchema" xmlns:p="http://schemas.microsoft.com/office/2006/metadata/properties" xmlns:ns2="8b6d770d-9fe2-4898-b015-a8d825ece434" targetNamespace="http://schemas.microsoft.com/office/2006/metadata/properties" ma:root="true" ma:fieldsID="674db32b5a8a0b375127f5d00a0a5732" ns2:_="">
     <xsd:import namespace="8b6d770d-9fe2-4898-b015-a8d825ece434"/>
@@ -6149,6 +6215,16 @@
 </ct:contentTypeSchema>
 </file>
 
+<file path=customXml/item3.xml><?xml version="1.0" encoding="utf-8"?>
+<p:properties xmlns:p="http://schemas.microsoft.com/office/2006/metadata/properties" xmlns:xsi="http://www.w3.org/2001/XMLSchema-instance" xmlns:pc="http://schemas.microsoft.com/office/infopath/2007/PartnerControls">
+  <documentManagement/>
+</p:properties>
+</file>
+
+<file path=customXml/item4.xml><?xml version="1.0" encoding="utf-8"?>
+<b:Sources xmlns:b="http://schemas.openxmlformats.org/officeDocument/2006/bibliography" xmlns="http://schemas.openxmlformats.org/officeDocument/2006/bibliography" SelectedStyle="\APASixthEditionOfficeOnline.xsl" StyleName="APA" Version="6"/>
+</file>
+
 <file path=customXml/itemProps1.xml><?xml version="1.0" encoding="utf-8"?>
 <ds:datastoreItem xmlns:ds="http://schemas.openxmlformats.org/officeDocument/2006/customXml" ds:itemID="{1EAFE88E-C664-4910-9D3E-159EF4530FAE}">
   <ds:schemaRefs>
@@ -6158,23 +6234,6 @@
 </file>
 
 <file path=customXml/itemProps2.xml><?xml version="1.0" encoding="utf-8"?>
-<ds:datastoreItem xmlns:ds="http://schemas.openxmlformats.org/officeDocument/2006/customXml" ds:itemID="{CB5774A1-796C-4D34-A9F1-AF48B60CEA6C}">
-  <ds:schemaRefs>
-    <ds:schemaRef ds:uri="http://schemas.microsoft.com/office/2006/metadata/properties"/>
-    <ds:schemaRef ds:uri="http://schemas.microsoft.com/office/infopath/2007/PartnerControls"/>
-  </ds:schemaRefs>
-</ds:datastoreItem>
-</file>
-
-<file path=customXml/itemProps3.xml><?xml version="1.0" encoding="utf-8"?>
-<ds:datastoreItem xmlns:ds="http://schemas.openxmlformats.org/officeDocument/2006/customXml" ds:itemID="{393FEEA6-D434-4B28-B035-556EB66551F6}">
-  <ds:schemaRefs>
-    <ds:schemaRef ds:uri="http://schemas.openxmlformats.org/officeDocument/2006/bibliography"/>
-  </ds:schemaRefs>
-</ds:datastoreItem>
-</file>
-
-<file path=customXml/itemProps4.xml><?xml version="1.0" encoding="utf-8"?>
 <ds:datastoreItem xmlns:ds="http://schemas.openxmlformats.org/officeDocument/2006/customXml" ds:itemID="{5A528826-74E5-4468-BC55-A5660BCF0A4A}">
   <ds:schemaRefs>
     <ds:schemaRef ds:uri="http://schemas.microsoft.com/office/2006/metadata/contentType"/>
@@ -6190,4 +6249,21 @@
     <ds:schemaRef ds:uri="http://schemas.microsoft.com/internal/obd"/>
   </ds:schemaRefs>
 </ds:datastoreItem>
+</file>
+
+<file path=customXml/itemProps3.xml><?xml version="1.0" encoding="utf-8"?>
+<ds:datastoreItem xmlns:ds="http://schemas.openxmlformats.org/officeDocument/2006/customXml" ds:itemID="{CB5774A1-796C-4D34-A9F1-AF48B60CEA6C}">
+  <ds:schemaRefs>
+    <ds:schemaRef ds:uri="http://schemas.microsoft.com/office/2006/metadata/properties"/>
+    <ds:schemaRef ds:uri="http://schemas.microsoft.com/office/infopath/2007/PartnerControls"/>
+  </ds:schemaRefs>
+</ds:datastoreItem>
+</file>
+
+<file path=customXml/itemProps4.xml><?xml version="1.0" encoding="utf-8"?>
+<ds:datastoreItem xmlns:ds="http://schemas.openxmlformats.org/officeDocument/2006/customXml" ds:itemID="{462DD17C-C5CF-D543-94F4-13F4393ADEE7}">
+  <ds:schemaRefs>
+    <ds:schemaRef ds:uri="http://schemas.openxmlformats.org/officeDocument/2006/bibliography"/>
+  </ds:schemaRefs>
+</ds:datastoreItem>
 </file>
</xml_diff>

<commit_message>
feat:creazione delle repo per Ingredient e Recipe
</commit_message>
<xml_diff>
--- a/documentation/template-documentazione-progetto.docx
+++ b/documentation/template-documentazione-progetto.docx
@@ -275,7 +275,7 @@
                   </wp:anchor>
                 </w:drawing>
               </mc:Choice>
-              <mc:Fallback xmlns:w16sdtdh="http://schemas.microsoft.com/office/word/2020/wordml/sdtdatahash" xmlns:w16du="http://schemas.microsoft.com/office/word/2023/wordml/word16du" xmlns:w16="http://schemas.microsoft.com/office/word/2018/wordml" xmlns:w16cex="http://schemas.microsoft.com/office/word/2018/wordml/cex" xmlns:oel="http://schemas.microsoft.com/office/2019/extlst">
+              <mc:Fallback xmlns:oel="http://schemas.microsoft.com/office/2019/extlst" xmlns:w16cex="http://schemas.microsoft.com/office/word/2018/wordml/cex" xmlns:w16="http://schemas.microsoft.com/office/word/2018/wordml" xmlns:w16du="http://schemas.microsoft.com/office/word/2023/wordml/word16du" xmlns:w16sdtdh="http://schemas.microsoft.com/office/word/2020/wordml/sdtdatahash">
                 <w:pict>
                   <v:line w14:anchorId="3D3A5B14" id="Connettore diritto 42" o:spid="_x0000_s1026" style="position:absolute;z-index:251655680;visibility:visible;mso-wrap-style:square;mso-width-percent:0;mso-wrap-distance-left:9pt;mso-wrap-distance-top:0;mso-wrap-distance-right:9pt;mso-wrap-distance-bottom:0;mso-position-horizontal:absolute;mso-position-horizontal-relative:text;mso-position-vertical:absolute;mso-position-vertical-relative:text;mso-width-percent:0;mso-width-relative:margin" from=".15pt,.6pt" to="425.55pt,.6pt" o:gfxdata="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" strokecolor="#4472c4 [3204]" strokeweight="1.75pt">
                     <v:stroke joinstyle="miter"/>
@@ -326,8 +326,6 @@
             </w:rPr>
             <w:t>UnivaqChef</w:t>
           </w:r>
-          <w:bookmarkStart w:id="0" w:name="_GoBack"/>
-          <w:bookmarkEnd w:id="0"/>
         </w:p>
         <w:p>
           <w:pPr>
@@ -353,11 +351,11 @@
             <w:tblLook w:val="01E0" w:firstRow="1" w:lastRow="1" w:firstColumn="1" w:lastColumn="1" w:noHBand="0" w:noVBand="0"/>
           </w:tblPr>
           <w:tblGrid>
-            <w:gridCol w:w="2709"/>
-            <w:gridCol w:w="1711"/>
-            <w:gridCol w:w="892"/>
-            <w:gridCol w:w="3484"/>
-            <w:gridCol w:w="61"/>
+            <w:gridCol w:w="2678"/>
+            <w:gridCol w:w="1692"/>
+            <w:gridCol w:w="878"/>
+            <w:gridCol w:w="3550"/>
+            <w:gridCol w:w="59"/>
           </w:tblGrid>
           <w:tr>
             <w:trPr>
@@ -579,6 +577,14 @@
                     <w:szCs w:val="22"/>
                   </w:rPr>
                 </w:pPr>
+                <w:r>
+                  <w:rPr>
+                    <w:rFonts w:cstheme="minorHAnsi"/>
+                    <w:color w:val="000000" w:themeColor="text1"/>
+                    <w:szCs w:val="22"/>
+                  </w:rPr>
+                  <w:t>michela.fazi@student.univaq.it</w:t>
+                </w:r>
               </w:p>
             </w:tc>
           </w:tr>
@@ -655,10 +661,18 @@
                   <w:adjustRightInd w:val="0"/>
                   <w:rPr>
                     <w:rFonts w:cstheme="minorHAnsi"/>
-                    <w:color w:val="333399"/>
+                    <w:color w:val="000000" w:themeColor="text1"/>
                     <w:szCs w:val="22"/>
                   </w:rPr>
                 </w:pPr>
+                <w:r>
+                  <w:rPr>
+                    <w:rFonts w:cstheme="minorHAnsi"/>
+                    <w:color w:val="000000" w:themeColor="text1"/>
+                    <w:szCs w:val="22"/>
+                  </w:rPr>
+                  <w:t>mattia.palladinelli@student.univaq.it</w:t>
+                </w:r>
               </w:p>
             </w:tc>
           </w:tr>
@@ -948,7 +962,7 @@
                   </wp:anchor>
                 </w:drawing>
               </mc:Choice>
-              <mc:Fallback xmlns:w16sdtdh="http://schemas.microsoft.com/office/word/2020/wordml/sdtdatahash" xmlns:w16du="http://schemas.microsoft.com/office/word/2023/wordml/word16du" xmlns:w16="http://schemas.microsoft.com/office/word/2018/wordml" xmlns:w16cex="http://schemas.microsoft.com/office/word/2018/wordml/cex" xmlns:oel="http://schemas.microsoft.com/office/2019/extlst">
+              <mc:Fallback xmlns:oel="http://schemas.microsoft.com/office/2019/extlst" xmlns:w16cex="http://schemas.microsoft.com/office/word/2018/wordml/cex" xmlns:w16="http://schemas.microsoft.com/office/word/2018/wordml" xmlns:w16du="http://schemas.microsoft.com/office/word/2023/wordml/word16du" xmlns:w16sdtdh="http://schemas.microsoft.com/office/word/2020/wordml/sdtdatahash">
                 <w:pict>
                   <v:line w14:anchorId="4A4FB2F2" id="Connettore diritto 43" o:spid="_x0000_s1026" style="position:absolute;z-index:251695616;visibility:visible;mso-wrap-style:square;mso-width-percent:0;mso-wrap-distance-left:9pt;mso-wrap-distance-top:0;mso-wrap-distance-right:9pt;mso-wrap-distance-bottom:0;mso-position-horizontal:absolute;mso-position-horizontal-relative:text;mso-position-vertical:absolute;mso-position-vertical-relative:text;mso-width-percent:0;mso-width-relative:margin" from=".15pt,6.05pt" to="425.55pt,6.05pt" o:gfxdata="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" strokecolor="#4472c4 [3204]" strokeweight="1.5pt">
                     <v:stroke joinstyle="miter"/>
@@ -1047,6 +1061,8 @@
             </w:rPr>
             <w:t>6</w:t>
           </w:r>
+          <w:bookmarkStart w:id="0" w:name="_GoBack"/>
+          <w:bookmarkEnd w:id="0"/>
         </w:p>
         <w:p/>
         <w:p>
@@ -6075,12 +6091,9 @@
 </file>
 
 <file path=customXml/item1.xml><?xml version="1.0" encoding="utf-8"?>
-<?mso-contentType ?>
-<FormTemplates xmlns="http://schemas.microsoft.com/sharepoint/v3/contenttype/forms">
-  <Display>DocumentLibraryForm</Display>
-  <Edit>DocumentLibraryForm</Edit>
-  <New>DocumentLibraryForm</New>
-</FormTemplates>
+<p:properties xmlns:p="http://schemas.microsoft.com/office/2006/metadata/properties" xmlns:xsi="http://www.w3.org/2001/XMLSchema-instance" xmlns:pc="http://schemas.microsoft.com/office/infopath/2007/PartnerControls">
+  <documentManagement/>
+</p:properties>
 </file>
 
 <file path=customXml/item2.xml><?xml version="1.0" encoding="utf-8"?>
@@ -6216,9 +6229,12 @@
 </file>
 
 <file path=customXml/item3.xml><?xml version="1.0" encoding="utf-8"?>
-<p:properties xmlns:p="http://schemas.microsoft.com/office/2006/metadata/properties" xmlns:xsi="http://www.w3.org/2001/XMLSchema-instance" xmlns:pc="http://schemas.microsoft.com/office/infopath/2007/PartnerControls">
-  <documentManagement/>
-</p:properties>
+<?mso-contentType ?>
+<FormTemplates xmlns="http://schemas.microsoft.com/sharepoint/v3/contenttype/forms">
+  <Display>DocumentLibraryForm</Display>
+  <Edit>DocumentLibraryForm</Edit>
+  <New>DocumentLibraryForm</New>
+</FormTemplates>
 </file>
 
 <file path=customXml/item4.xml><?xml version="1.0" encoding="utf-8"?>
@@ -6226,9 +6242,10 @@
 </file>
 
 <file path=customXml/itemProps1.xml><?xml version="1.0" encoding="utf-8"?>
-<ds:datastoreItem xmlns:ds="http://schemas.openxmlformats.org/officeDocument/2006/customXml" ds:itemID="{1EAFE88E-C664-4910-9D3E-159EF4530FAE}">
+<ds:datastoreItem xmlns:ds="http://schemas.openxmlformats.org/officeDocument/2006/customXml" ds:itemID="{CB5774A1-796C-4D34-A9F1-AF48B60CEA6C}">
   <ds:schemaRefs>
-    <ds:schemaRef ds:uri="http://schemas.microsoft.com/sharepoint/v3/contenttype/forms"/>
+    <ds:schemaRef ds:uri="http://schemas.microsoft.com/office/2006/metadata/properties"/>
+    <ds:schemaRef ds:uri="http://schemas.microsoft.com/office/infopath/2007/PartnerControls"/>
   </ds:schemaRefs>
 </ds:datastoreItem>
 </file>
@@ -6252,16 +6269,15 @@
 </file>
 
 <file path=customXml/itemProps3.xml><?xml version="1.0" encoding="utf-8"?>
-<ds:datastoreItem xmlns:ds="http://schemas.openxmlformats.org/officeDocument/2006/customXml" ds:itemID="{CB5774A1-796C-4D34-A9F1-AF48B60CEA6C}">
+<ds:datastoreItem xmlns:ds="http://schemas.openxmlformats.org/officeDocument/2006/customXml" ds:itemID="{1EAFE88E-C664-4910-9D3E-159EF4530FAE}">
   <ds:schemaRefs>
-    <ds:schemaRef ds:uri="http://schemas.microsoft.com/office/2006/metadata/properties"/>
-    <ds:schemaRef ds:uri="http://schemas.microsoft.com/office/infopath/2007/PartnerControls"/>
+    <ds:schemaRef ds:uri="http://schemas.microsoft.com/sharepoint/v3/contenttype/forms"/>
   </ds:schemaRefs>
 </ds:datastoreItem>
 </file>
 
 <file path=customXml/itemProps4.xml><?xml version="1.0" encoding="utf-8"?>
-<ds:datastoreItem xmlns:ds="http://schemas.openxmlformats.org/officeDocument/2006/customXml" ds:itemID="{462DD17C-C5CF-D543-94F4-13F4393ADEE7}">
+<ds:datastoreItem xmlns:ds="http://schemas.openxmlformats.org/officeDocument/2006/customXml" ds:itemID="{FF35952A-DB19-7B47-99BC-B93A54586AE7}">
   <ds:schemaRefs>
     <ds:schemaRef ds:uri="http://schemas.openxmlformats.org/officeDocument/2006/bibliography"/>
   </ds:schemaRefs>

</xml_diff>